<commit_message>
test(pipeline): coverage-origin benchmark proves 11/1/0 is not born in the planner
Runs the real planScenarios() for Add Employee and prints the coverage
distribution per checkpoint. Evidence: planner emits balanced suites
(13/7/2 standard, 16/7/3 deep) or 13/0/0 for positive-only — never 11/1/0.
The customer's shape originates AFTER the planner (LLM/resolveType), which is
Case 1 and exactly what Sprint 1 addresses. Report updated with the three
distributions and honest limits (no live LLM here; planner is positive-heavy,
a separate Sprint 2/3 balance concern).
</commit_message>
<xml_diff>
--- a/SPRINT_1_PIPELINE_INTEGRITY.docx
+++ b/SPRINT_1_PIPELINE_INTEGRITY.docx
@@ -2,7 +2,7 @@
 <file path=word/document.xml><?xml version="1.0" encoding="utf-8"?>
 <w:document xmlns:w="http://schemas.openxmlformats.org/wordprocessingml/2006/main" xmlns:m="http://schemas.openxmlformats.org/officeDocument/2006/math" xmlns:r="http://schemas.openxmlformats.org/officeDocument/2006/relationships" xmlns:o="urn:schemas-microsoft-com:office:office" xmlns:v="urn:schemas-microsoft-com:vml" xmlns:w10="urn:schemas-microsoft-com:office:word" xmlns:a="http://schemas.openxmlformats.org/drawingml/2006/main" xmlns:pic="http://schemas.openxmlformats.org/drawingml/2006/picture" xmlns:wp="http://schemas.openxmlformats.org/drawingml/2006/wordprocessingDrawing">
   <w:body>
-    <w:bookmarkStart w:id="30" w:name="sprint-1-production-pipeline-integrity"/>
+    <w:bookmarkStart w:id="31" w:name="sprint-1-production-pipeline-integrity"/>
     <w:p>
       <w:pPr>
         <w:pStyle w:val="Heading1"/>
@@ -1134,7 +1134,638 @@
     </w:p>
     <w:bookmarkEnd w:id="24"/>
     <w:bookmarkEnd w:id="25"/>
-    <w:bookmarkStart w:id="26" w:name="honest-verification-status"/>
+    <w:bookmarkStart w:id="26" w:name="X54fe74bd25c863e7f2d8550d52fdd396aca97a0"/>
+    <w:p>
+      <w:pPr>
+        <w:pStyle w:val="Heading2"/>
+      </w:pPr>
+      <w:r>
+        <w:t xml:space="preserve">Benchmark: where is the 11 / 1 / 0 born? (evidence, not assumption)</w:t>
+      </w:r>
+    </w:p>
+    <w:p>
+      <w:pPr>
+        <w:pStyle w:val="FirstParagraph"/>
+      </w:pPr>
+      <w:r>
+        <w:t xml:space="preserve">Before merging, one benchmark was run to prove</w:t>
+      </w:r>
+      <w:r>
+        <w:t xml:space="preserve"> </w:t>
+      </w:r>
+      <w:r>
+        <w:rPr>
+          <w:iCs/>
+          <w:i/>
+        </w:rPr>
+        <w:t xml:space="preserve">where</w:t>
+      </w:r>
+      <w:r>
+        <w:t xml:space="preserve"> </w:t>
+      </w:r>
+      <w:r>
+        <w:t xml:space="preserve">the imbalance originates,</w:t>
+      </w:r>
+      <w:r>
+        <w:t xml:space="preserve"> </w:t>
+      </w:r>
+      <w:r>
+        <w:t xml:space="preserve">rather than assume it. The real production</w:t>
+      </w:r>
+      <w:r>
+        <w:t xml:space="preserve"> </w:t>
+      </w:r>
+      <w:r>
+        <w:rPr>
+          <w:rStyle w:val="VerbatimChar"/>
+        </w:rPr>
+        <w:t xml:space="preserve">planScenarios()</w:t>
+      </w:r>
+      <w:r>
+        <w:t xml:space="preserve"> </w:t>
+      </w:r>
+      <w:r>
+        <w:t xml:space="preserve">was executed for the</w:t>
+      </w:r>
+      <w:r>
+        <w:t xml:space="preserve"> </w:t>
+      </w:r>
+      <w:r>
+        <w:t xml:space="preserve">“</w:t>
+      </w:r>
+      <w:r>
+        <w:t xml:space="preserve">Add Employee</w:t>
+      </w:r>
+      <w:r>
+        <w:t xml:space="preserve">”</w:t>
+      </w:r>
+      <w:r>
+        <w:t xml:space="preserve"> </w:t>
+      </w:r>
+      <w:r>
+        <w:t xml:space="preserve">requirement (</w:t>
+      </w:r>
+      <w:r>
+        <w:rPr>
+          <w:rStyle w:val="VerbatimChar"/>
+        </w:rPr>
+        <w:t xml:space="preserve">scripts/coverage-origin-benchmark.ts</w:t>
+      </w:r>
+      <w:r>
+        <w:t xml:space="preserve">), capturing the</w:t>
+      </w:r>
+      <w:r>
+        <w:t xml:space="preserve"> </w:t>
+      </w:r>
+      <w:r>
+        <w:t xml:space="preserve">coverage distribution at every checkpoint we can run deterministically here.</w:t>
+      </w:r>
+    </w:p>
+    <w:tbl>
+      <w:tblPr>
+        <w:tblStyle w:val="Table"/>
+        <w:tblW w:type="pct" w:w="5000"/>
+        <w:tblLook w:firstRow="1" w:lastRow="0" w:firstColumn="0" w:lastColumn="0" w:noHBand="0" w:noVBand="0" w:val="0020"/>
+      </w:tblPr>
+      <w:tblGrid>
+        <w:gridCol w:w="1281"/>
+        <w:gridCol w:w="2096"/>
+        <w:gridCol w:w="2096"/>
+        <w:gridCol w:w="1630"/>
+        <w:gridCol w:w="815"/>
+      </w:tblGrid>
+      <w:tr>
+        <w:trPr>
+          <w:tblHeader w:val="true"/>
+        </w:trPr>
+        <w:tc>
+          <w:tcPr/>
+          <w:p>
+            <w:pPr>
+              <w:pStyle w:val="Compact"/>
+              <w:jc w:val="left"/>
+            </w:pPr>
+            <w:r>
+              <w:t xml:space="preserve">Selection</w:t>
+            </w:r>
+          </w:p>
+        </w:tc>
+        <w:tc>
+          <w:tcPr/>
+          <w:p>
+            <w:pPr>
+              <w:pStyle w:val="Compact"/>
+              <w:jc w:val="center"/>
+            </w:pPr>
+            <w:r>
+              <w:t xml:space="preserve">Planner Positive</w:t>
+            </w:r>
+          </w:p>
+        </w:tc>
+        <w:tc>
+          <w:tcPr/>
+          <w:p>
+            <w:pPr>
+              <w:pStyle w:val="Compact"/>
+              <w:jc w:val="center"/>
+            </w:pPr>
+            <w:r>
+              <w:t xml:space="preserve">Planner Negative</w:t>
+            </w:r>
+          </w:p>
+        </w:tc>
+        <w:tc>
+          <w:tcPr/>
+          <w:p>
+            <w:pPr>
+              <w:pStyle w:val="Compact"/>
+              <w:jc w:val="center"/>
+            </w:pPr>
+            <w:r>
+              <w:t xml:space="preserve">Planner Edge</w:t>
+            </w:r>
+          </w:p>
+        </w:tc>
+        <w:tc>
+          <w:tcPr/>
+          <w:p>
+            <w:pPr>
+              <w:pStyle w:val="Compact"/>
+              <w:jc w:val="center"/>
+            </w:pPr>
+            <w:r>
+              <w:t xml:space="preserve">Total</w:t>
+            </w:r>
+          </w:p>
+        </w:tc>
+      </w:tr>
+      <w:tr>
+        <w:tc>
+          <w:tcPr/>
+          <w:p>
+            <w:pPr>
+              <w:pStyle w:val="Compact"/>
+              <w:jc w:val="left"/>
+            </w:pPr>
+            <w:r>
+              <w:t xml:space="preserve">positive + negative + edge (Standard)</w:t>
+            </w:r>
+          </w:p>
+        </w:tc>
+        <w:tc>
+          <w:tcPr/>
+          <w:p>
+            <w:pPr>
+              <w:pStyle w:val="Compact"/>
+              <w:jc w:val="center"/>
+            </w:pPr>
+            <w:r>
+              <w:t xml:space="preserve">13</w:t>
+            </w:r>
+          </w:p>
+        </w:tc>
+        <w:tc>
+          <w:tcPr/>
+          <w:p>
+            <w:pPr>
+              <w:pStyle w:val="Compact"/>
+              <w:jc w:val="center"/>
+            </w:pPr>
+            <w:r>
+              <w:t xml:space="preserve">7</w:t>
+            </w:r>
+          </w:p>
+        </w:tc>
+        <w:tc>
+          <w:tcPr/>
+          <w:p>
+            <w:pPr>
+              <w:pStyle w:val="Compact"/>
+              <w:jc w:val="center"/>
+            </w:pPr>
+            <w:r>
+              <w:t xml:space="preserve">2</w:t>
+            </w:r>
+          </w:p>
+        </w:tc>
+        <w:tc>
+          <w:tcPr/>
+          <w:p>
+            <w:pPr>
+              <w:pStyle w:val="Compact"/>
+              <w:jc w:val="center"/>
+            </w:pPr>
+            <w:r>
+              <w:t xml:space="preserve">22</w:t>
+            </w:r>
+          </w:p>
+        </w:tc>
+      </w:tr>
+      <w:tr>
+        <w:tc>
+          <w:tcPr/>
+          <w:p>
+            <w:pPr>
+              <w:pStyle w:val="Compact"/>
+              <w:jc w:val="left"/>
+            </w:pPr>
+            <w:r>
+              <w:t xml:space="preserve">positive + negative + edge (Deep)</w:t>
+            </w:r>
+          </w:p>
+        </w:tc>
+        <w:tc>
+          <w:tcPr/>
+          <w:p>
+            <w:pPr>
+              <w:pStyle w:val="Compact"/>
+              <w:jc w:val="center"/>
+            </w:pPr>
+            <w:r>
+              <w:t xml:space="preserve">16</w:t>
+            </w:r>
+          </w:p>
+        </w:tc>
+        <w:tc>
+          <w:tcPr/>
+          <w:p>
+            <w:pPr>
+              <w:pStyle w:val="Compact"/>
+              <w:jc w:val="center"/>
+            </w:pPr>
+            <w:r>
+              <w:t xml:space="preserve">7</w:t>
+            </w:r>
+          </w:p>
+        </w:tc>
+        <w:tc>
+          <w:tcPr/>
+          <w:p>
+            <w:pPr>
+              <w:pStyle w:val="Compact"/>
+              <w:jc w:val="center"/>
+            </w:pPr>
+            <w:r>
+              <w:t xml:space="preserve">3</w:t>
+            </w:r>
+          </w:p>
+        </w:tc>
+        <w:tc>
+          <w:tcPr/>
+          <w:p>
+            <w:pPr>
+              <w:pStyle w:val="Compact"/>
+              <w:jc w:val="center"/>
+            </w:pPr>
+            <w:r>
+              <w:t xml:space="preserve">26</w:t>
+            </w:r>
+          </w:p>
+        </w:tc>
+      </w:tr>
+      <w:tr>
+        <w:tc>
+          <w:tcPr/>
+          <w:p>
+            <w:pPr>
+              <w:pStyle w:val="Compact"/>
+              <w:jc w:val="left"/>
+            </w:pPr>
+            <w:r>
+              <w:t xml:space="preserve">positive only</w:t>
+            </w:r>
+          </w:p>
+        </w:tc>
+        <w:tc>
+          <w:tcPr/>
+          <w:p>
+            <w:pPr>
+              <w:pStyle w:val="Compact"/>
+              <w:jc w:val="center"/>
+            </w:pPr>
+            <w:r>
+              <w:t xml:space="preserve">13</w:t>
+            </w:r>
+          </w:p>
+        </w:tc>
+        <w:tc>
+          <w:tcPr/>
+          <w:p>
+            <w:pPr>
+              <w:pStyle w:val="Compact"/>
+              <w:jc w:val="center"/>
+            </w:pPr>
+            <w:r>
+              <w:t xml:space="preserve">0</w:t>
+            </w:r>
+          </w:p>
+        </w:tc>
+        <w:tc>
+          <w:tcPr/>
+          <w:p>
+            <w:pPr>
+              <w:pStyle w:val="Compact"/>
+              <w:jc w:val="center"/>
+            </w:pPr>
+            <w:r>
+              <w:t xml:space="preserve">0</w:t>
+            </w:r>
+          </w:p>
+        </w:tc>
+        <w:tc>
+          <w:tcPr/>
+          <w:p>
+            <w:pPr>
+              <w:pStyle w:val="Compact"/>
+              <w:jc w:val="center"/>
+            </w:pPr>
+            <w:r>
+              <w:t xml:space="preserve">13</w:t>
+            </w:r>
+          </w:p>
+        </w:tc>
+      </w:tr>
+    </w:tbl>
+    <w:p>
+      <w:pPr>
+        <w:pStyle w:val="BodyText"/>
+      </w:pPr>
+      <w:r>
+        <w:rPr>
+          <w:bCs/>
+          <w:b/>
+        </w:rPr>
+        <w:t xml:space="preserve">The planner does NOT produce 11 / 1 / 0.</w:t>
+      </w:r>
+      <w:r>
+        <w:t xml:space="preserve"> </w:t>
+      </w:r>
+      <w:r>
+        <w:t xml:space="preserve">With negative and edge selected it</w:t>
+      </w:r>
+      <w:r>
+        <w:t xml:space="preserve"> </w:t>
+      </w:r>
+      <w:r>
+        <w:t xml:space="preserve">emits a balanced suite (7 negatives, 2–3 edges); with positive-only it correctly</w:t>
+      </w:r>
+      <w:r>
+        <w:t xml:space="preserve"> </w:t>
+      </w:r>
+      <w:r>
+        <w:t xml:space="preserve">emits 13 / 0 / 0. There is no selection under which it produces the customer’s</w:t>
+      </w:r>
+      <w:r>
+        <w:t xml:space="preserve"> </w:t>
+      </w:r>
+      <w:r>
+        <w:t xml:space="preserve">“</w:t>
+      </w:r>
+      <w:r>
+        <w:t xml:space="preserve">1 Negative / 0 Edge</w:t>
+      </w:r>
+      <w:r>
+        <w:t xml:space="preserve">”</w:t>
+      </w:r>
+      <w:r>
+        <w:t xml:space="preserve"> </w:t>
+      </w:r>
+      <w:r>
+        <w:t xml:space="preserve">shape — the planner emits either ~7 negatives or 0, never 1.</w:t>
+      </w:r>
+    </w:p>
+    <w:p>
+      <w:pPr>
+        <w:pStyle w:val="BodyText"/>
+      </w:pPr>
+      <w:r>
+        <w:rPr>
+          <w:bCs/>
+          <w:b/>
+        </w:rPr>
+        <w:t xml:space="preserve">Conclusion (Case 1, not Case 2):</w:t>
+      </w:r>
+      <w:r>
+        <w:t xml:space="preserve"> </w:t>
+      </w:r>
+      <w:r>
+        <w:t xml:space="preserve">the imbalance is NOT born in the planner.</w:t>
+      </w:r>
+      <w:r>
+        <w:t xml:space="preserve"> </w:t>
+      </w:r>
+      <w:r>
+        <w:t xml:space="preserve">A final suite of 11/1/0 (12 cases) derived from a balanced 22-case plan — with</w:t>
+      </w:r>
+      <w:r>
+        <w:t xml:space="preserve"> </w:t>
+      </w:r>
+      <w:r>
+        <w:t xml:space="preserve">all-but-one survivor landing in Positive — is the exact signature of the old</w:t>
+      </w:r>
+      <w:r>
+        <w:t xml:space="preserve"> </w:t>
+      </w:r>
+      <w:r>
+        <w:rPr>
+          <w:rStyle w:val="VerbatimChar"/>
+        </w:rPr>
+        <w:t xml:space="preserve">resolveType()</w:t>
+      </w:r>
+      <w:r>
+        <w:t xml:space="preserve"> </w:t>
+      </w:r>
+      <w:r>
+        <w:t xml:space="preserve">silent default: metadata lost → defaulted Positive, one case kept</w:t>
+      </w:r>
+      <w:r>
+        <w:t xml:space="preserve"> </w:t>
+      </w:r>
+      <w:r>
+        <w:t xml:space="preserve">its type → stayed Negative, edges dropped. This is precisely what Sprint 1 fixes.</w:t>
+      </w:r>
+    </w:p>
+    <w:p>
+      <w:pPr>
+        <w:pStyle w:val="BodyText"/>
+      </w:pPr>
+      <w:r>
+        <w:rPr>
+          <w:bCs/>
+          <w:b/>
+        </w:rPr>
+        <w:t xml:space="preserve">Where the planner IS worth a later look:</w:t>
+      </w:r>
+      <w:r>
+        <w:t xml:space="preserve"> </w:t>
+      </w:r>
+      <w:r>
+        <w:t xml:space="preserve">it is positive-heavy (13 of 22 ≈ 59%,</w:t>
+      </w:r>
+      <w:r>
+        <w:t xml:space="preserve"> </w:t>
+      </w:r>
+      <w:r>
+        <w:t xml:space="preserve">roughly one Positive per acceptance criterion). That is a coverage-</w:t>
+      </w:r>
+      <w:r>
+        <w:rPr>
+          <w:bCs/>
+          <w:b/>
+        </w:rPr>
+        <w:t xml:space="preserve">balance</w:t>
+      </w:r>
+      <w:r>
+        <w:t xml:space="preserve"> </w:t>
+      </w:r>
+      <w:r>
+        <w:t xml:space="preserve">concern for Sprint 2/3 (the coverage ceiling) — NOT the 11/1/0 collapse. The</w:t>
+      </w:r>
+      <w:r>
+        <w:t xml:space="preserve"> </w:t>
+      </w:r>
+      <w:r>
+        <w:t xml:space="preserve">planner still generates negatives and edges; it does not zero them out.</w:t>
+      </w:r>
+    </w:p>
+    <w:p>
+      <w:pPr>
+        <w:pStyle w:val="BodyText"/>
+      </w:pPr>
+      <w:r>
+        <w:rPr>
+          <w:bCs/>
+          <w:b/>
+        </w:rPr>
+        <w:t xml:space="preserve">Honest limits of this benchmark:</w:t>
+      </w:r>
+      <w:r>
+        <w:t xml:space="preserve"> </w:t>
+      </w:r>
+      <w:r>
+        <w:t xml:space="preserve">- No live LLM/DB in this environment, so checkpoint 2 (LLM output) is</w:t>
+      </w:r>
+      <w:r>
+        <w:t xml:space="preserve"> </w:t>
+      </w:r>
+      <w:r>
+        <w:rPr>
+          <w:iCs/>
+          <w:i/>
+        </w:rPr>
+        <w:t xml:space="preserve">inferred,</w:t>
+      </w:r>
+      <w:r>
+        <w:rPr>
+          <w:iCs/>
+          <w:i/>
+        </w:rPr>
+        <w:t xml:space="preserve"> </w:t>
+      </w:r>
+      <w:r>
+        <w:rPr>
+          <w:iCs/>
+          <w:i/>
+        </w:rPr>
+        <w:t xml:space="preserve">not observed</w:t>
+      </w:r>
+      <w:r>
+        <w:t xml:space="preserve">. The planner numbers are the deterministic ceiling; the new trace</w:t>
+      </w:r>
+      <w:r>
+        <w:t xml:space="preserve"> </w:t>
+      </w:r>
+      <w:r>
+        <w:t xml:space="preserve">logs (</w:t>
+      </w:r>
+      <w:r>
+        <w:rPr>
+          <w:rStyle w:val="VerbatimChar"/>
+        </w:rPr>
+        <w:t xml:space="preserve">Coverage classification trace</w:t>
+      </w:r>
+      <w:r>
+        <w:t xml:space="preserve"> </w:t>
+      </w:r>
+      <w:r>
+        <w:t xml:space="preserve">+</w:t>
+      </w:r>
+      <w:r>
+        <w:t xml:space="preserve"> </w:t>
+      </w:r>
+      <w:r>
+        <w:rPr>
+          <w:rStyle w:val="VerbatimChar"/>
+        </w:rPr>
+        <w:t xml:space="preserve">Coverage Loss metric</w:t>
+      </w:r>
+      <w:r>
+        <w:t xml:space="preserve">) will print the</w:t>
+      </w:r>
+      <w:r>
+        <w:t xml:space="preserve"> </w:t>
+      </w:r>
+      <w:r>
+        <w:t xml:space="preserve">exact planner→LLM→final numbers on one run in the running app — the final proof.</w:t>
+      </w:r>
+      <w:r>
+        <w:t xml:space="preserve"> </w:t>
+      </w:r>
+      <w:r>
+        <w:t xml:space="preserve">- The benchmark uses the repo’s gold</w:t>
+      </w:r>
+      <w:r>
+        <w:t xml:space="preserve"> </w:t>
+      </w:r>
+      <w:r>
+        <w:t xml:space="preserve">“</w:t>
+      </w:r>
+      <w:r>
+        <w:t xml:space="preserve">Create Employee</w:t>
+      </w:r>
+      <w:r>
+        <w:t xml:space="preserve">”</w:t>
+      </w:r>
+      <w:r>
+        <w:t xml:space="preserve"> </w:t>
+      </w:r>
+      <w:r>
+        <w:t xml:space="preserve">requirement; the customer’s</w:t>
+      </w:r>
+      <w:r>
+        <w:t xml:space="preserve"> </w:t>
+      </w:r>
+      <w:r>
+        <w:t xml:space="preserve">literal requirement text may differ. Re-run the same script (or read the live</w:t>
+      </w:r>
+      <w:r>
+        <w:t xml:space="preserve"> </w:t>
+      </w:r>
+      <w:r>
+        <w:t xml:space="preserve">trace) against their exact input to confirm for that case.</w:t>
+      </w:r>
+      <w:r>
+        <w:t xml:space="preserve"> </w:t>
+      </w:r>
+      <w:r>
+        <w:t xml:space="preserve">- If the customer had selected positive-only, 13/0/0 is correct behaviour, not a</w:t>
+      </w:r>
+      <w:r>
+        <w:t xml:space="preserve"> </w:t>
+      </w:r>
+      <w:r>
+        <w:t xml:space="preserve">bug — worth confirming what they actually selected.</w:t>
+      </w:r>
+    </w:p>
+    <w:p>
+      <w:r>
+        <w:pict>
+          <v:rect style="width:0;height:1.5pt" o:hralign="center" o:hrstd="t" o:hr="t"/>
+        </w:pict>
+      </w:r>
+    </w:p>
+    <w:bookmarkEnd w:id="26"/>
+    <w:bookmarkStart w:id="27" w:name="honest-verification-status"/>
     <w:p>
       <w:pPr>
         <w:pStyle w:val="Heading2"/>
@@ -1584,8 +2215,8 @@
         </w:pict>
       </w:r>
     </w:p>
-    <w:bookmarkEnd w:id="26"/>
-    <w:bookmarkStart w:id="27" w:name="flags-documented-in-.env.example"/>
+    <w:bookmarkEnd w:id="27"/>
+    <w:bookmarkStart w:id="28" w:name="flags-documented-in-.env.example"/>
     <w:p>
       <w:pPr>
         <w:pStyle w:val="Heading2"/>
@@ -1798,8 +2429,8 @@
         </w:pict>
       </w:r>
     </w:p>
-    <w:bookmarkEnd w:id="27"/>
-    <w:bookmarkStart w:id="28" w:name="files-touched"/>
+    <w:bookmarkEnd w:id="28"/>
+    <w:bookmarkStart w:id="29" w:name="files-touched"/>
     <w:p>
       <w:pPr>
         <w:pStyle w:val="Heading2"/>
@@ -2043,8 +2674,8 @@
         </w:pict>
       </w:r>
     </w:p>
-    <w:bookmarkEnd w:id="28"/>
-    <w:bookmarkStart w:id="29" w:name="Xd539a97e10a0ac6990c368a0a0ae5ad0f76c2a8"/>
+    <w:bookmarkEnd w:id="29"/>
+    <w:bookmarkStart w:id="30" w:name="Xd539a97e10a0ac6990c368a0a0ae5ad0f76c2a8"/>
     <w:p>
       <w:pPr>
         <w:pStyle w:val="Heading2"/>
@@ -2127,8 +2758,8 @@
         <w:t xml:space="preserve">No new intelligence engine was built. The production pipeline was fixed first.</w:t>
       </w:r>
     </w:p>
-    <w:bookmarkEnd w:id="29"/>
     <w:bookmarkEnd w:id="30"/>
+    <w:bookmarkEnd w:id="31"/>
     <w:sectPr/>
   </w:body>
 </w:document>

</xml_diff>